<commit_message>
Convo Now Reminder Balance: reframe as carry-forward overstatement (not over-grant)
A number is flagged only when its displayed balance (latest month's
Monthly Value) is overstated because earlier-month usage in the same
billing cycle was not carried forward. Adds displayed_remainder /
correct_remainder / overstated_by. Explainer + Word doc rewritten to the
calendar-month-vs-billing-cycle carry-forward framing.

Co-Authored-By: Claude Opus 4.8 <noreply@anthropic.com>
Claude-Session: https://claude.ai/code/session_01F66m49mBUZemMGSQJ6psvs
</commit_message>
<xml_diff>
--- a/Convo_Now_Reminder_Balance_Issue.docx
+++ b/Convo_Now_Reminder_Balance_Issue.docx
@@ -11,15 +11,15 @@
           <w:b/>
           <w:bCs/>
           <w:color w:val="1A2234"/>
-          <w:sz w:val="34"/>
-          <w:szCs w:val="34"/>
+          <w:sz w:val="32"/>
+          <w:szCs w:val="32"/>
         </w:rPr>
         <w:t xml:space="preserve">Convo Now Reminder Balance — Billing Issue Explainer</w:t>
       </w:r>
     </w:p>
     <w:p>
       <w:pPr>
-        <w:spacing w:after="200"/>
+        <w:spacing w:after="160"/>
       </w:pPr>
       <w:r>
         <w:rPr>
@@ -37,7 +37,7 @@
         <w:pBdr>
           <w:bottom w:val="single" w:color="D0D5DD" w:sz="6"/>
         </w:pBdr>
-        <w:spacing w:after="160" w:before="80"/>
+        <w:spacing w:after="180" w:before="80"/>
       </w:pPr>
       <w:r>
         <w:t xml:space="preserve"/>
@@ -46,7 +46,7 @@
     <w:p>
       <w:pPr>
         <w:pStyle w:val="Heading2"/>
-        <w:spacing w:after="120" w:before="240"/>
+        <w:spacing w:after="100" w:before="220"/>
       </w:pPr>
       <w:r>
         <w:rPr>
@@ -69,56 +69,32 @@
           <w:b/>
           <w:bCs/>
         </w:rPr>
-        <w:t xml:space="preserve">usage minutes recorded on the Monthly Values records are not correct</w:t>
-      </w:r>
-      <w:r>
-        <w:t xml:space="preserve">, so the reported </w:t>
-      </w:r>
-      <w:r>
-        <w:rPr>
-          <w:b/>
-          <w:bCs/>
-        </w:rPr>
-        <w:t xml:space="preserve">Remainder Balance</w:t>
-      </w:r>
-      <w:r>
-        <w:t xml:space="preserve"> for Convo Now: Access Complimentary consumers is </w:t>
-      </w:r>
-      <w:r>
-        <w:rPr>
-          <w:b/>
-          <w:bCs/>
-        </w:rPr>
-        <w:t xml:space="preserve">wrong as a number</w:t>
-      </w:r>
-      <w:r>
-        <w:t xml:space="preserve"> — this is a </w:t>
-      </w:r>
-      <w:r>
-        <w:rPr>
-          <w:b/>
-          <w:bCs/>
-        </w:rPr>
-        <w:t xml:space="preserve">data accuracy / reporting (misinformation)</w:t>
-      </w:r>
-      <w:r>
-        <w:t xml:space="preserve"> problem, not consumers getting extra free minutes (the plan allowance itself is enforced correctly). </w:t>
-      </w:r>
-      <w:r>
-        <w:rPr>
-          <w:b/>
-          <w:bCs/>
-        </w:rPr>
-        <w:t xml:space="preserve">Root cause sits on the data-engineering side</w:t>
-      </w:r>
-      <w:r>
-        <w:t xml:space="preserve">, in how the usage minutes are calculated and written to the Monthly Values records.</w:t>
+        <w:t xml:space="preserve">Convo Now Remainder Balance is inaccurate when a consumer's billing cycle crosses a calendar-month boundary, because Monthly Value records are calculated by calendar month instead of following the consumer's actual billing cycle.</w:t>
+      </w:r>
+    </w:p>
+    <w:p>
+      <w:pPr>
+        <w:spacing w:after="120"/>
+      </w:pPr>
+      <w:r>
+        <w:t xml:space="preserve">The remaining minutes from the previous calendar month should carry forward into the next month when both months are part of the same billing cycle.</w:t>
+      </w:r>
+    </w:p>
+    <w:p>
+      <w:pPr>
+        <w:pBdr>
+          <w:bottom w:val="single" w:color="D0D5DD" w:sz="6"/>
+        </w:pBdr>
+        <w:spacing w:after="180" w:before="80"/>
+      </w:pPr>
+      <w:r>
+        <w:t xml:space="preserve"/>
       </w:r>
     </w:p>
     <w:p>
       <w:pPr>
         <w:pStyle w:val="Heading2"/>
-        <w:spacing w:after="120" w:before="240"/>
+        <w:spacing w:after="100" w:before="220"/>
       </w:pPr>
       <w:r>
         <w:rPr>
@@ -134,49 +110,320 @@
         <w:spacing w:after="120"/>
       </w:pPr>
       <w:r>
-        <w:t xml:space="preserve">Remainder Balance on the Monthly Value object is a calculated property (custom equation):</w:t>
+        <w:t xml:space="preserve">The Monthly Value Remainder Balance is a calculated property:</w:t>
+      </w:r>
+    </w:p>
+    <w:p>
+      <w:pPr>
+        <w:shd w:fill="F2F4F7" w:color="auto" w:val="clear"/>
+        <w:spacing w:after="140" w:before="60"/>
+        <w:jc w:val="center"/>
+      </w:pPr>
+      <w:r>
+        <w:rPr>
+          <w:rFonts w:ascii="Consolas" w:cs="Consolas" w:eastAsia="Consolas" w:hAnsi="Consolas"/>
+          <w:b/>
+          <w:bCs/>
+          <w:color w:val="1A2234"/>
+          <w:sz w:val="22"/>
+          <w:szCs w:val="22"/>
+        </w:rPr>
+        <w:t xml:space="preserve">Remainder Balance = Credit Minimum − Convo Now Minutes Used</w:t>
+      </w:r>
+    </w:p>
+    <w:p>
+      <w:pPr>
+        <w:spacing w:after="120"/>
+      </w:pPr>
+      <w:r>
+        <w:t xml:space="preserve">For </w:t>
+      </w:r>
+      <w:r>
+        <w:rPr>
+          <w:b/>
+          <w:bCs/>
+        </w:rPr>
+        <w:t xml:space="preserve">Convo Now: Access Complimentary</w:t>
+      </w:r>
+      <w:r>
+        <w:t xml:space="preserve">, the Credit Minimum is </w:t>
+      </w:r>
+      <w:r>
+        <w:rPr>
+          <w:b/>
+          <w:bCs/>
+        </w:rPr>
+        <w:t xml:space="preserve">20 minutes</w:t>
+      </w:r>
+      <w:r>
+        <w:t xml:space="preserve">, therefore:</w:t>
+      </w:r>
+    </w:p>
+    <w:p>
+      <w:pPr>
+        <w:shd w:fill="F2F4F7" w:color="auto" w:val="clear"/>
+        <w:spacing w:after="140" w:before="60"/>
+        <w:jc w:val="center"/>
+      </w:pPr>
+      <w:r>
+        <w:rPr>
+          <w:rFonts w:ascii="Consolas" w:cs="Consolas" w:eastAsia="Consolas" w:hAnsi="Consolas"/>
+          <w:b/>
+          <w:bCs/>
+          <w:color w:val="1A2234"/>
+          <w:sz w:val="22"/>
+          <w:szCs w:val="22"/>
+        </w:rPr>
+        <w:t xml:space="preserve">Remainder Balance = 20 − Convo Now Minutes Used</w:t>
+      </w:r>
+    </w:p>
+    <w:p>
+      <w:pPr>
+        <w:spacing w:after="120"/>
+      </w:pPr>
+      <w:r>
+        <w:t xml:space="preserve">The calculation is currently performed at the </w:t>
+      </w:r>
+      <w:r>
+        <w:rPr>
+          <w:b/>
+          <w:bCs/>
+        </w:rPr>
+        <w:t xml:space="preserve">Monthly Value / calendar-month level</w:t>
+      </w:r>
+      <w:r>
+        <w:t xml:space="preserve">. The consumer's allowance needs to be evaluated against the </w:t>
+      </w:r>
+      <w:r>
+        <w:rPr>
+          <w:b/>
+          <w:bCs/>
+        </w:rPr>
+        <w:t xml:space="preserve">billing cycle</w:t>
+      </w:r>
+      <w:r>
+        <w:t xml:space="preserve">, not reset when the calendar month changes.</w:t>
       </w:r>
     </w:p>
     <w:p>
       <w:pPr>
         <w:pBdr>
-          <w:left w:val="single" w:color="2F8F7F" w:sz="18" w:space="8"/>
+          <w:bottom w:val="single" w:color="D0D5DD" w:sz="6"/>
         </w:pBdr>
+        <w:spacing w:after="180" w:before="80"/>
+      </w:pPr>
+      <w:r>
+        <w:t xml:space="preserve"/>
+      </w:r>
+    </w:p>
+    <w:p>
+      <w:pPr>
+        <w:pStyle w:val="Heading2"/>
+        <w:spacing w:after="100" w:before="220"/>
+      </w:pPr>
+      <w:r>
+        <w:rPr>
+          <w:b/>
+          <w:bCs/>
+          <w:color w:val="1A2234"/>
+        </w:rPr>
+        <w:t xml:space="preserve">Why the problem happens</w:t>
+      </w:r>
+    </w:p>
+    <w:p>
+      <w:pPr>
+        <w:spacing w:after="120"/>
+      </w:pPr>
+      <w:r>
+        <w:t xml:space="preserve">The consumer's billing cycle and the calendar month do not always start and end on the same dates. For example, a consumer may have a billing cycle of:</w:t>
+      </w:r>
+    </w:p>
+    <w:p>
+      <w:pPr>
         <w:shd w:fill="F2F4F7" w:color="auto" w:val="clear"/>
-        <w:spacing w:after="160" w:before="60"/>
+        <w:spacing w:after="140" w:before="60"/>
+        <w:jc w:val="center"/>
       </w:pPr>
       <w:r>
         <w:rPr>
           <w:rFonts w:ascii="Consolas" w:cs="Consolas" w:eastAsia="Consolas" w:hAnsi="Consolas"/>
+          <w:b/>
+          <w:bCs/>
           <w:color w:val="1A2234"/>
-          <w:sz w:val="20"/>
-          <w:szCs w:val="20"/>
-        </w:rPr>
-        <w:t xml:space="preserve">Remainder Balance = string_to_number(Credit Minimum) − Convo Now Minutes Used</w:t>
-      </w:r>
-    </w:p>
-    <w:p>
-      <w:pPr>
-        <w:spacing w:after="120"/>
-      </w:pPr>
-      <w:r>
-        <w:t xml:space="preserve">i.e. </w:t>
-      </w:r>
-      <w:r>
-        <w:rPr>
-          <w:b/>
-          <w:bCs/>
-        </w:rPr>
-        <w:t xml:space="preserve">Remainder Balance = 20 − Convo Now Minutes Used</w:t>
-      </w:r>
-      <w:r>
-        <w:t xml:space="preserve">, computed per Monthly Value (per calendar month). The Credit Minimum (20) is a flat value reset every month, and the only input is Convo Now Minutes Used.</w:t>
-      </w:r>
-    </w:p>
-    <w:p>
-      <w:pPr>
-        <w:pStyle w:val="Heading2"/>
-        <w:spacing w:after="120" w:before="240"/>
+          <w:sz w:val="22"/>
+          <w:szCs w:val="22"/>
+        </w:rPr>
+        <w:t xml:space="preserve">September 21, 2026 → October 21, 2026   (one 30-day billing cycle)</w:t>
+      </w:r>
+    </w:p>
+    <w:p>
+      <w:pPr>
+        <w:spacing w:after="120"/>
+      </w:pPr>
+      <w:r>
+        <w:t xml:space="preserve">However, the Monthly Value records are separated by calendar month:</w:t>
+      </w:r>
+    </w:p>
+    <w:p>
+      <w:pPr>
+        <w:pStyle w:val="ListParagraph"/>
+        <w:numPr>
+          <w:ilvl w:val="0"/>
+          <w:numId w:val="2"/>
+        </w:numPr>
+        <w:spacing w:after="70"/>
+      </w:pPr>
+      <w:r>
+        <w:t xml:space="preserve">September 2026 Monthly Value</w:t>
+      </w:r>
+    </w:p>
+    <w:p>
+      <w:pPr>
+        <w:pStyle w:val="ListParagraph"/>
+        <w:numPr>
+          <w:ilvl w:val="0"/>
+          <w:numId w:val="2"/>
+        </w:numPr>
+        <w:spacing w:after="70"/>
+      </w:pPr>
+      <w:r>
+        <w:t xml:space="preserve">October 2026 Monthly Value</w:t>
+      </w:r>
+    </w:p>
+    <w:p>
+      <w:pPr>
+        <w:spacing w:after="120"/>
+      </w:pPr>
+      <w:r>
+        <w:t xml:space="preserve">When the consumer uses minutes during September, the September Monthly Value correctly calculates the remaining balance. But when October begins, the October Monthly Value starts a new calculation based only on October usage — it does not carry forward the remaining balance from September, even though the consumer is still within the same billing cycle.</w:t>
+      </w:r>
+    </w:p>
+    <w:p>
+      <w:pPr>
+        <w:pStyle w:val="Heading3"/>
+        <w:spacing w:after="80" w:before="160"/>
+      </w:pPr>
+      <w:r>
+        <w:rPr>
+          <w:b/>
+          <w:bCs/>
+          <w:color w:val="2F8F7F"/>
+        </w:rPr>
+        <w:t xml:space="preserve">Example</w:t>
+      </w:r>
+    </w:p>
+    <w:p>
+      <w:pPr>
+        <w:spacing w:after="120"/>
+      </w:pPr>
+      <w:r>
+        <w:t xml:space="preserve">The consumer has a </w:t>
+      </w:r>
+      <w:r>
+        <w:rPr>
+          <w:b/>
+          <w:bCs/>
+        </w:rPr>
+        <w:t xml:space="preserve">20-minute allowance</w:t>
+      </w:r>
+      <w:r>
+        <w:t xml:space="preserve"> for the billing cycle.</w:t>
+      </w:r>
+    </w:p>
+    <w:p>
+      <w:pPr>
+        <w:pStyle w:val="ListParagraph"/>
+        <w:numPr>
+          <w:ilvl w:val="0"/>
+          <w:numId w:val="2"/>
+        </w:numPr>
+        <w:spacing w:after="70"/>
+      </w:pPr>
+      <w:r>
+        <w:t xml:space="preserve">September 21–30: minutes used </w:t>
+      </w:r>
+      <w:r>
+        <w:rPr>
+          <w:b/>
+          <w:bCs/>
+        </w:rPr>
+        <w:t xml:space="preserve">8</w:t>
+      </w:r>
+      <w:r>
+        <w:t xml:space="preserve">, remaining </w:t>
+      </w:r>
+      <w:r>
+        <w:rPr>
+          <w:b/>
+          <w:bCs/>
+        </w:rPr>
+        <w:t xml:space="preserve">12</w:t>
+      </w:r>
+    </w:p>
+    <w:p>
+      <w:pPr>
+        <w:pStyle w:val="ListParagraph"/>
+        <w:numPr>
+          <w:ilvl w:val="0"/>
+          <w:numId w:val="2"/>
+        </w:numPr>
+        <w:spacing w:after="70"/>
+      </w:pPr>
+      <w:r>
+        <w:t xml:space="preserve">October: additional minutes used </w:t>
+      </w:r>
+      <w:r>
+        <w:rPr>
+          <w:b/>
+          <w:bCs/>
+        </w:rPr>
+        <w:t xml:space="preserve">0</w:t>
+      </w:r>
+      <w:r>
+        <w:t xml:space="preserve"> — still in the Sept 21 → Oct 21 cycle, so the balance should still be </w:t>
+      </w:r>
+      <w:r>
+        <w:rPr>
+          <w:b/>
+          <w:bCs/>
+        </w:rPr>
+        <w:t xml:space="preserve">12 minutes</w:t>
+      </w:r>
+    </w:p>
+    <w:p>
+      <w:pPr>
+        <w:spacing w:after="120"/>
+      </w:pPr>
+      <w:r>
+        <w:t xml:space="preserve">Instead, the October Monthly Value calculates </w:t>
+      </w:r>
+      <w:r>
+        <w:rPr>
+          <w:b/>
+          <w:bCs/>
+          <w:color w:val="C0392B"/>
+        </w:rPr>
+        <w:t xml:space="preserve">20 − 0 = 20 minutes</w:t>
+      </w:r>
+      <w:r>
+        <w:t xml:space="preserve">, making it look like the balance reset to 20 on October 1 — even though the billing cycle did not reset.</w:t>
+      </w:r>
+    </w:p>
+    <w:p>
+      <w:pPr>
+        <w:pBdr>
+          <w:bottom w:val="single" w:color="D0D5DD" w:sz="6"/>
+        </w:pBdr>
+        <w:spacing w:after="180" w:before="80"/>
+      </w:pPr>
+      <w:r>
+        <w:t xml:space="preserve"/>
+      </w:r>
+    </w:p>
+    <w:p>
+      <w:pPr>
+        <w:pStyle w:val="Heading1"/>
+        <w:spacing w:after="120" w:before="300"/>
       </w:pPr>
       <w:r>
         <w:rPr>
@@ -184,51 +431,7 @@
           <w:bCs/>
           <w:color w:val="1A2234"/>
         </w:rPr>
-        <w:t xml:space="preserve">Why the problem happens</w:t>
-      </w:r>
-    </w:p>
-    <w:p>
-      <w:pPr>
-        <w:spacing w:after="120"/>
-      </w:pPr>
-      <w:r>
-        <w:rPr>
-          <w:b/>
-          <w:bCs/>
-        </w:rPr>
-        <w:t xml:space="preserve">Primary cause — incorrect usage minutes (data engineering). </w:t>
-      </w:r>
-      <w:r>
-        <w:t xml:space="preserve">The Convo Now Minutes Used value written to the Monthly Values records is not being calculated correctly by the data pipeline. Since the formula is 20 − Convo Now Minutes Used, wrong usage minutes produce a wrong remainder balance directly.</w:t>
-      </w:r>
-    </w:p>
-    <w:p>
-      <w:pPr>
-        <w:spacing w:after="120"/>
-      </w:pPr>
-      <w:r>
-        <w:rPr>
-          <w:b/>
-          <w:bCs/>
-        </w:rPr>
-        <w:t xml:space="preserve">Compounding factor — per-month tracking across cycle boundaries. </w:t>
-      </w:r>
-      <w:r>
-        <w:t xml:space="preserve">Usage is stored one record per calendar month, each resetting to a fresh 20. When one billing cycle spans two calendar months (e.g. Sept and Oct), there are two records, each starting at 20, treated as two separate 20-minute buckets instead of one shared bucket for the cycle. The cycle's allowance effectively becomes 40 minutes (20 + 20) instead of 20.</w:t>
-      </w:r>
-    </w:p>
-    <w:p>
-      <w:pPr>
-        <w:pStyle w:val="Heading2"/>
-        <w:spacing w:after="120" w:before="240"/>
-      </w:pPr>
-      <w:r>
-        <w:rPr>
-          <w:b/>
-          <w:bCs/>
-          <w:color w:val="1A2234"/>
-        </w:rPr>
-        <w:t xml:space="preserve">Real example — number 41599276 (Lori Wenzel)</w:t>
+        <w:t xml:space="preserve">Real example — Number 41599276 (Lori Wenzel)</w:t>
       </w:r>
     </w:p>
     <w:p>
@@ -238,28 +441,82 @@
           <w:ilvl w:val="0"/>
           <w:numId w:val="2"/>
         </w:numPr>
+        <w:spacing w:after="70"/>
+      </w:pPr>
+      <w:r>
+        <w:rPr>
+          <w:b/>
+          <w:bCs/>
+        </w:rPr>
+        <w:t xml:space="preserve">Plan: </w:t>
+      </w:r>
+      <w:r>
+        <w:t xml:space="preserve">Convo Now: Access Complimentary</w:t>
+      </w:r>
+    </w:p>
+    <w:p>
+      <w:pPr>
+        <w:pStyle w:val="ListParagraph"/>
+        <w:numPr>
+          <w:ilvl w:val="0"/>
+          <w:numId w:val="2"/>
+        </w:numPr>
+        <w:spacing w:after="70"/>
+      </w:pPr>
+      <w:r>
+        <w:rPr>
+          <w:b/>
+          <w:bCs/>
+        </w:rPr>
+        <w:t xml:space="preserve">Status: </w:t>
+      </w:r>
+      <w:r>
+        <w:t xml:space="preserve">Live</w:t>
+      </w:r>
+    </w:p>
+    <w:p>
+      <w:pPr>
+        <w:pStyle w:val="ListParagraph"/>
+        <w:numPr>
+          <w:ilvl w:val="0"/>
+          <w:numId w:val="2"/>
+        </w:numPr>
+        <w:spacing w:after="70"/>
+      </w:pPr>
+      <w:r>
+        <w:rPr>
+          <w:b/>
+          <w:bCs/>
+        </w:rPr>
+        <w:t xml:space="preserve">Billing cycle: </w:t>
+      </w:r>
+      <w:r>
+        <w:t xml:space="preserve">September 21, 2026 → October 21, 2026 (30 days)</w:t>
+      </w:r>
+    </w:p>
+    <w:p>
+      <w:pPr>
+        <w:pStyle w:val="ListParagraph"/>
+        <w:numPr>
+          <w:ilvl w:val="0"/>
+          <w:numId w:val="2"/>
+        </w:numPr>
+        <w:spacing w:after="70"/>
+      </w:pPr>
+      <w:r>
+        <w:rPr>
+          <w:b/>
+          <w:bCs/>
+        </w:rPr>
+        <w:t xml:space="preserve">Allowance: </w:t>
+      </w:r>
+      <w:r>
+        <w:t xml:space="preserve">20 minutes for the billing cycle</w:t>
+      </w:r>
+    </w:p>
+    <w:p>
+      <w:pPr>
         <w:spacing w:after="80"/>
-      </w:pPr>
-      <w:r>
-        <w:t xml:space="preserve">Plan: Convo Now: Access Complimentary    Status: Live</w:t>
-      </w:r>
-    </w:p>
-    <w:p>
-      <w:pPr>
-        <w:pStyle w:val="ListParagraph"/>
-        <w:numPr>
-          <w:ilvl w:val="0"/>
-          <w:numId w:val="2"/>
-        </w:numPr>
-        <w:spacing w:after="80"/>
-      </w:pPr>
-      <w:r>
-        <w:t xml:space="preserve">Billing cycle: 30 days, Sept 21, 2026 → Oct 21, 2026</w:t>
-      </w:r>
-    </w:p>
-    <w:p>
-      <w:pPr>
-        <w:spacing w:after="120" w:before="60"/>
       </w:pPr>
       <w:r>
         <w:t xml:space="preserve"/>
@@ -278,9 +535,10 @@
         </w:tblBorders>
       </w:tblPr>
       <w:tblGrid>
-        <w:gridCol w:w="3600"/>
-        <w:gridCol w:w="2160"/>
-        <w:gridCol w:w="2880"/>
+        <w:gridCol w:w="3200"/>
+        <w:gridCol w:w="2400"/>
+        <w:gridCol w:w="2560"/>
+        <w:gridCol w:w="2480"/>
       </w:tblGrid>
       <w:tr>
         <w:trPr>
@@ -288,7 +546,7 @@
         </w:trPr>
         <w:tc>
           <w:tcPr>
-            <w:tcW w:type="dxa" w:w="3600"/>
+            <w:tcW w:type="dxa" w:w="3200"/>
             <w:shd w:fill="1A2234" w:color="auto" w:val="clear"/>
             <w:tcMar>
               <w:top w:type="dxa" w:w="60"/>
@@ -298,6 +556,9 @@
             </w:tcMar>
           </w:tcPr>
           <w:p>
+            <w:pPr>
+              <w:jc w:val="left"/>
+            </w:pPr>
             <w:r>
               <w:rPr>
                 <w:b/>
@@ -306,13 +567,13 @@
                 <w:sz w:val="20"/>
                 <w:szCs w:val="20"/>
               </w:rPr>
-              <w:t xml:space="preserve">Monthly Value</w:t>
+              <w:t xml:space="preserve">Period</w:t>
             </w:r>
           </w:p>
         </w:tc>
         <w:tc>
           <w:tcPr>
-            <w:tcW w:type="dxa" w:w="2160"/>
+            <w:tcW w:type="dxa" w:w="2400"/>
             <w:shd w:fill="1A2234" w:color="auto" w:val="clear"/>
             <w:tcMar>
               <w:top w:type="dxa" w:w="60"/>
@@ -322,6 +583,9 @@
             </w:tcMar>
           </w:tcPr>
           <w:p>
+            <w:pPr>
+              <w:jc w:val="center"/>
+            </w:pPr>
             <w:r>
               <w:rPr>
                 <w:b/>
@@ -330,13 +594,13 @@
                 <w:sz w:val="20"/>
                 <w:szCs w:val="20"/>
               </w:rPr>
-              <w:t xml:space="preserve">Minutes used</w:t>
+              <w:t xml:space="preserve">Minutes Used</w:t>
             </w:r>
           </w:p>
         </w:tc>
         <w:tc>
           <w:tcPr>
-            <w:tcW w:type="dxa" w:w="2880"/>
+            <w:tcW w:type="dxa" w:w="2560"/>
             <w:shd w:fill="1A2234" w:color="auto" w:val="clear"/>
             <w:tcMar>
               <w:top w:type="dxa" w:w="60"/>
@@ -346,6 +610,9 @@
             </w:tcMar>
           </w:tcPr>
           <w:p>
+            <w:pPr>
+              <w:jc w:val="center"/>
+            </w:pPr>
             <w:r>
               <w:rPr>
                 <w:b/>
@@ -354,7 +621,34 @@
                 <w:sz w:val="20"/>
                 <w:szCs w:val="20"/>
               </w:rPr>
-              <w:t xml:space="preserve">Remainder Balance</w:t>
+              <w:t xml:space="preserve">Expected Remainder</w:t>
+            </w:r>
+          </w:p>
+        </w:tc>
+        <w:tc>
+          <w:tcPr>
+            <w:tcW w:type="dxa" w:w="2480"/>
+            <w:shd w:fill="1A2234" w:color="auto" w:val="clear"/>
+            <w:tcMar>
+              <w:top w:type="dxa" w:w="60"/>
+              <w:left w:type="dxa" w:w="100"/>
+              <w:bottom w:type="dxa" w:w="60"/>
+              <w:right w:type="dxa" w:w="100"/>
+            </w:tcMar>
+          </w:tcPr>
+          <w:p>
+            <w:pPr>
+              <w:jc w:val="center"/>
+            </w:pPr>
+            <w:r>
+              <w:rPr>
+                <w:b/>
+                <w:bCs/>
+                <w:color w:val="FFFFFF"/>
+                <w:sz w:val="20"/>
+                <w:szCs w:val="20"/>
+              </w:rPr>
+              <w:t xml:space="preserve">Current Monthly Value</w:t>
             </w:r>
           </w:p>
         </w:tc>
@@ -365,7 +659,7 @@
         </w:trPr>
         <w:tc>
           <w:tcPr>
-            <w:tcW w:type="dxa" w:w="3600"/>
+            <w:tcW w:type="dxa" w:w="3200"/>
             <w:tcMar>
               <w:top w:type="dxa" w:w="60"/>
               <w:left w:type="dxa" w:w="100"/>
@@ -374,6 +668,9 @@
             </w:tcMar>
           </w:tcPr>
           <w:p>
+            <w:pPr>
+              <w:jc w:val="left"/>
+            </w:pPr>
             <w:r>
               <w:rPr>
                 <w:b w:val="false"/>
@@ -382,13 +679,13 @@
                 <w:sz w:val="20"/>
                 <w:szCs w:val="20"/>
               </w:rPr>
-              <w:t xml:space="preserve">September 2026</w:t>
+              <w:t xml:space="preserve">September 21–30</w:t>
             </w:r>
           </w:p>
         </w:tc>
         <w:tc>
           <w:tcPr>
-            <w:tcW w:type="dxa" w:w="2160"/>
+            <w:tcW w:type="dxa" w:w="2400"/>
             <w:tcMar>
               <w:top w:type="dxa" w:w="60"/>
               <w:left w:type="dxa" w:w="100"/>
@@ -414,7 +711,7 @@
         </w:tc>
         <w:tc>
           <w:tcPr>
-            <w:tcW w:type="dxa" w:w="2880"/>
+            <w:tcW w:type="dxa" w:w="2560"/>
             <w:tcMar>
               <w:top w:type="dxa" w:w="60"/>
               <w:left w:type="dxa" w:w="100"/>
@@ -430,7 +727,33 @@
               <w:rPr>
                 <w:b/>
                 <w:bCs/>
-                <w:color w:val="1A2234"/>
+                <w:color w:val="2F8F7F"/>
+                <w:sz w:val="20"/>
+                <w:szCs w:val="20"/>
+              </w:rPr>
+              <w:t xml:space="preserve">12</w:t>
+            </w:r>
+          </w:p>
+        </w:tc>
+        <w:tc>
+          <w:tcPr>
+            <w:tcW w:type="dxa" w:w="2480"/>
+            <w:tcMar>
+              <w:top w:type="dxa" w:w="60"/>
+              <w:left w:type="dxa" w:w="100"/>
+              <w:bottom w:type="dxa" w:w="60"/>
+              <w:right w:type="dxa" w:w="100"/>
+            </w:tcMar>
+          </w:tcPr>
+          <w:p>
+            <w:pPr>
+              <w:jc w:val="center"/>
+            </w:pPr>
+            <w:r>
+              <w:rPr>
+                <w:b w:val="false"/>
+                <w:bCs w:val="false"/>
+                <w:color w:val="2F8F7F"/>
                 <w:sz w:val="20"/>
                 <w:szCs w:val="20"/>
               </w:rPr>
@@ -445,7 +768,7 @@
         </w:trPr>
         <w:tc>
           <w:tcPr>
-            <w:tcW w:type="dxa" w:w="3600"/>
+            <w:tcW w:type="dxa" w:w="3200"/>
             <w:tcMar>
               <w:top w:type="dxa" w:w="60"/>
               <w:left w:type="dxa" w:w="100"/>
@@ -454,6 +777,9 @@
             </w:tcMar>
           </w:tcPr>
           <w:p>
+            <w:pPr>
+              <w:jc w:val="left"/>
+            </w:pPr>
             <w:r>
               <w:rPr>
                 <w:b w:val="false"/>
@@ -462,13 +788,13 @@
                 <w:sz w:val="20"/>
                 <w:szCs w:val="20"/>
               </w:rPr>
-              <w:t xml:space="preserve">October 2026</w:t>
+              <w:t xml:space="preserve">October 1–21</w:t>
             </w:r>
           </w:p>
         </w:tc>
         <w:tc>
           <w:tcPr>
-            <w:tcW w:type="dxa" w:w="2160"/>
+            <w:tcW w:type="dxa" w:w="2400"/>
             <w:tcMar>
               <w:top w:type="dxa" w:w="60"/>
               <w:left w:type="dxa" w:w="100"/>
@@ -494,7 +820,7 @@
         </w:tc>
         <w:tc>
           <w:tcPr>
-            <w:tcW w:type="dxa" w:w="2880"/>
+            <w:tcW w:type="dxa" w:w="2560"/>
             <w:tcMar>
               <w:top w:type="dxa" w:w="60"/>
               <w:left w:type="dxa" w:w="100"/>
@@ -510,7 +836,33 @@
               <w:rPr>
                 <w:b/>
                 <w:bCs/>
-                <w:color w:val="1A2234"/>
+                <w:color w:val="2F8F7F"/>
+                <w:sz w:val="20"/>
+                <w:szCs w:val="20"/>
+              </w:rPr>
+              <w:t xml:space="preserve">12</w:t>
+            </w:r>
+          </w:p>
+        </w:tc>
+        <w:tc>
+          <w:tcPr>
+            <w:tcW w:type="dxa" w:w="2480"/>
+            <w:tcMar>
+              <w:top w:type="dxa" w:w="60"/>
+              <w:left w:type="dxa" w:w="100"/>
+              <w:bottom w:type="dxa" w:w="60"/>
+              <w:right w:type="dxa" w:w="100"/>
+            </w:tcMar>
+          </w:tcPr>
+          <w:p>
+            <w:pPr>
+              <w:jc w:val="center"/>
+            </w:pPr>
+            <w:r>
+              <w:rPr>
+                <w:b/>
+                <w:bCs/>
+                <w:color w:val="C0392B"/>
                 <w:sz w:val="20"/>
                 <w:szCs w:val="20"/>
               </w:rPr>
@@ -522,7 +874,7 @@
     </w:tbl>
     <w:p>
       <w:pPr>
-        <w:spacing w:before="120"/>
+        <w:spacing w:after="80"/>
       </w:pPr>
       <w:r>
         <w:t xml:space="preserve"/>
@@ -530,22 +882,199 @@
     </w:p>
     <w:p>
       <w:pPr>
+        <w:pStyle w:val="Heading3"/>
+        <w:spacing w:after="80" w:before="160"/>
+      </w:pPr>
+      <w:r>
+        <w:rPr>
+          <w:b/>
+          <w:bCs/>
+          <w:color w:val="2F8F7F"/>
+        </w:rPr>
+        <w:t xml:space="preserve">What should happen</w:t>
+      </w:r>
+    </w:p>
+    <w:p>
+      <w:pPr>
+        <w:spacing w:after="120"/>
+      </w:pPr>
+      <w:r>
+        <w:t xml:space="preserve">The consumer used 8 minutes in September: </w:t>
+      </w:r>
+      <w:r>
+        <w:rPr>
+          <w:b/>
+          <w:bCs/>
+        </w:rPr>
+        <w:t xml:space="preserve">20 − 8 = 12 minutes remaining</w:t>
+      </w:r>
+      <w:r>
+        <w:t xml:space="preserve">. October has 0 additional usage and is still in the same cycle, so the balance should remain </w:t>
+      </w:r>
+      <w:r>
+        <w:rPr>
+          <w:b/>
+          <w:bCs/>
+        </w:rPr>
+        <w:t xml:space="preserve">12 minutes</w:t>
+      </w:r>
+      <w:r>
+        <w:t xml:space="preserve">.</w:t>
+      </w:r>
+    </w:p>
+    <w:p>
+      <w:pPr>
+        <w:pStyle w:val="Heading3"/>
+        <w:spacing w:after="80" w:before="160"/>
+      </w:pPr>
+      <w:r>
+        <w:rPr>
+          <w:b/>
+          <w:bCs/>
+          <w:color w:val="2F8F7F"/>
+        </w:rPr>
+        <w:t xml:space="preserve">What currently happens</w:t>
+      </w:r>
+    </w:p>
+    <w:p>
+      <w:pPr>
+        <w:spacing w:after="120"/>
+      </w:pPr>
+      <w:r>
+        <w:t xml:space="preserve">The October Monthly Value sees 0 minutes used and calculates </w:t>
+      </w:r>
+      <w:r>
+        <w:rPr>
+          <w:b/>
+          <w:bCs/>
+          <w:color w:val="C0392B"/>
+        </w:rPr>
+        <w:t xml:space="preserve">20 − 0 = 20 minutes</w:t>
+      </w:r>
+      <w:r>
+        <w:t xml:space="preserve"> — inaccurate, because it ignores the 8 minutes already used during the same billing cycle.</w:t>
+      </w:r>
+    </w:p>
+    <w:p>
+      <w:pPr>
+        <w:pStyle w:val="Heading3"/>
+        <w:spacing w:after="80" w:before="160"/>
+      </w:pPr>
+      <w:r>
+        <w:rPr>
+          <w:b/>
+          <w:bCs/>
+          <w:color w:val="2F8F7F"/>
+        </w:rPr>
+        <w:t xml:space="preserve">Key point</w:t>
+      </w:r>
+    </w:p>
+    <w:p>
+      <w:pPr>
+        <w:spacing w:after="120"/>
+      </w:pPr>
+      <w:r>
+        <w:rPr>
+          <w:b/>
+          <w:bCs/>
+        </w:rPr>
+        <w:t xml:space="preserve">The calendar month changed, but the billing cycle did not. </w:t>
+      </w:r>
+      <w:r>
+        <w:t xml:space="preserve">The remaining 12 minutes should carry forward from September into October until the cycle ends on October 21.</w:t>
+      </w:r>
+    </w:p>
+    <w:p>
+      <w:pPr>
+        <w:pBdr>
+          <w:bottom w:val="single" w:color="D0D5DD" w:sz="6"/>
+        </w:pBdr>
+        <w:spacing w:after="180" w:before="80"/>
+      </w:pPr>
+      <w:r>
+        <w:t xml:space="preserve"/>
+      </w:r>
+    </w:p>
+    <w:p>
+      <w:pPr>
+        <w:pStyle w:val="Heading2"/>
+        <w:spacing w:after="100" w:before="220"/>
+      </w:pPr>
+      <w:r>
+        <w:rPr>
+          <w:b/>
+          <w:bCs/>
+          <w:color w:val="1A2234"/>
+        </w:rPr>
+        <w:t xml:space="preserve">What the calculation should look like</w:t>
+      </w:r>
+    </w:p>
+    <w:p>
+      <w:pPr>
+        <w:spacing w:after="120"/>
+      </w:pPr>
+      <w:r>
+        <w:t xml:space="preserve">Instead of calculating the remainder independently per calendar month (September 20 − 8 = 12, October 20 − 0 = 20), the system should calculate across the entire billing cycle:</w:t>
+      </w:r>
+    </w:p>
+    <w:p>
+      <w:pPr>
         <w:pStyle w:val="ListParagraph"/>
         <w:numPr>
           <w:ilvl w:val="0"/>
           <w:numId w:val="2"/>
         </w:numPr>
-        <w:spacing w:after="80"/>
-      </w:pPr>
-      <w:r>
-        <w:rPr>
-          <w:b/>
-          <w:bCs/>
-        </w:rPr>
-        <w:t xml:space="preserve">Correct</w:t>
-      </w:r>
-      <w:r>
-        <w:t xml:space="preserve"> remaining for the cycle: 20 − 8 used = </w:t>
+        <w:spacing w:after="70"/>
+      </w:pPr>
+      <w:r>
+        <w:rPr>
+          <w:b/>
+          <w:bCs/>
+        </w:rPr>
+        <w:t xml:space="preserve">Billing cycle: </w:t>
+      </w:r>
+      <w:r>
+        <w:t xml:space="preserve">September 21 → October 21</w:t>
+      </w:r>
+    </w:p>
+    <w:p>
+      <w:pPr>
+        <w:pStyle w:val="ListParagraph"/>
+        <w:numPr>
+          <w:ilvl w:val="0"/>
+          <w:numId w:val="2"/>
+        </w:numPr>
+        <w:spacing w:after="70"/>
+      </w:pPr>
+      <w:r>
+        <w:rPr>
+          <w:b/>
+          <w:bCs/>
+        </w:rPr>
+        <w:t xml:space="preserve">Total usage during cycle: </w:t>
+      </w:r>
+      <w:r>
+        <w:t xml:space="preserve">8 minutes</w:t>
+      </w:r>
+    </w:p>
+    <w:p>
+      <w:pPr>
+        <w:pStyle w:val="ListParagraph"/>
+        <w:numPr>
+          <w:ilvl w:val="0"/>
+          <w:numId w:val="2"/>
+        </w:numPr>
+        <w:spacing w:after="70"/>
+      </w:pPr>
+      <w:r>
+        <w:rPr>
+          <w:b/>
+          <w:bCs/>
+        </w:rPr>
+        <w:t xml:space="preserve">Correct remainder: </w:t>
+      </w:r>
+      <w:r>
+        <w:t xml:space="preserve">20 − 8 = </w:t>
       </w:r>
       <w:r>
         <w:rPr>
@@ -555,6 +1084,145 @@
         </w:rPr>
         <w:t xml:space="preserve">12 minutes</w:t>
       </w:r>
+    </w:p>
+    <w:p>
+      <w:pPr>
+        <w:spacing w:after="120"/>
+      </w:pPr>
+      <w:r>
+        <w:t xml:space="preserve">If there is no additional usage during October, 12 minutes remains 12 minutes until additional usage occurs or the billing cycle ends.</w:t>
+      </w:r>
+    </w:p>
+    <w:p>
+      <w:pPr>
+        <w:pBdr>
+          <w:bottom w:val="single" w:color="D0D5DD" w:sz="6"/>
+        </w:pBdr>
+        <w:spacing w:after="180" w:before="80"/>
+      </w:pPr>
+      <w:r>
+        <w:t xml:space="preserve"/>
+      </w:r>
+    </w:p>
+    <w:p>
+      <w:pPr>
+        <w:pStyle w:val="Heading2"/>
+        <w:spacing w:after="100" w:before="220"/>
+      </w:pPr>
+      <w:r>
+        <w:rPr>
+          <w:b/>
+          <w:bCs/>
+          <w:color w:val="1A2234"/>
+        </w:rPr>
+        <w:t xml:space="preserve">How we detect the issue — QA page logic</w:t>
+      </w:r>
+    </w:p>
+    <w:p>
+      <w:pPr>
+        <w:spacing w:after="120"/>
+      </w:pPr>
+      <w:r>
+        <w:t xml:space="preserve">For every Convo Now + Live + Convo Now: Access Complimentary number, the QA page:</w:t>
+      </w:r>
+    </w:p>
+    <w:p>
+      <w:pPr>
+        <w:pStyle w:val="ListParagraph"/>
+        <w:numPr>
+          <w:ilvl w:val="0"/>
+          <w:numId w:val="3"/>
+        </w:numPr>
+        <w:spacing w:after="70"/>
+      </w:pPr>
+      <w:r>
+        <w:t xml:space="preserve">Pulls the associated Subscription billing cycle.</w:t>
+      </w:r>
+    </w:p>
+    <w:p>
+      <w:pPr>
+        <w:pStyle w:val="ListParagraph"/>
+        <w:numPr>
+          <w:ilvl w:val="0"/>
+          <w:numId w:val="3"/>
+        </w:numPr>
+        <w:spacing w:after="70"/>
+      </w:pPr>
+      <w:r>
+        <w:t xml:space="preserve">Identifies the billing-cycle start date.</w:t>
+      </w:r>
+    </w:p>
+    <w:p>
+      <w:pPr>
+        <w:pStyle w:val="ListParagraph"/>
+        <w:numPr>
+          <w:ilvl w:val="0"/>
+          <w:numId w:val="3"/>
+        </w:numPr>
+        <w:spacing w:after="70"/>
+      </w:pPr>
+      <w:r>
+        <w:t xml:space="preserve">Identifies the billing-cycle end date.</w:t>
+      </w:r>
+    </w:p>
+    <w:p>
+      <w:pPr>
+        <w:pStyle w:val="ListParagraph"/>
+        <w:numPr>
+          <w:ilvl w:val="0"/>
+          <w:numId w:val="3"/>
+        </w:numPr>
+        <w:spacing w:after="70"/>
+      </w:pPr>
+      <w:r>
+        <w:t xml:space="preserve">Calculates the end date from the billing-cycle type when the end date is missing.</w:t>
+      </w:r>
+    </w:p>
+    <w:p>
+      <w:pPr>
+        <w:pStyle w:val="ListParagraph"/>
+        <w:numPr>
+          <w:ilvl w:val="0"/>
+          <w:numId w:val="3"/>
+        </w:numPr>
+        <w:spacing w:after="70"/>
+      </w:pPr>
+      <w:r>
+        <w:t xml:space="preserve">Identifies all Monthly Value records that overlap the billing cycle.</w:t>
+      </w:r>
+    </w:p>
+    <w:p>
+      <w:pPr>
+        <w:pStyle w:val="ListParagraph"/>
+        <w:numPr>
+          <w:ilvl w:val="0"/>
+          <w:numId w:val="3"/>
+        </w:numPr>
+        <w:spacing w:after="70"/>
+      </w:pPr>
+      <w:r>
+        <w:t xml:space="preserve">Calculates the total Convo Now minutes used across the applicable portion of the billing cycle.</w:t>
+      </w:r>
+    </w:p>
+    <w:p>
+      <w:pPr>
+        <w:pStyle w:val="ListParagraph"/>
+        <w:numPr>
+          <w:ilvl w:val="0"/>
+          <w:numId w:val="3"/>
+        </w:numPr>
+        <w:spacing w:after="70"/>
+      </w:pPr>
+      <w:r>
+        <w:t xml:space="preserve">Calculates the correct billing-cycle remainder: </w:t>
+      </w:r>
+      <w:r>
+        <w:rPr>
+          <w:b/>
+          <w:bCs/>
+        </w:rPr>
+        <w:t xml:space="preserve">20 − total Convo Now minutes used during the billing cycle</w:t>
+      </w:r>
       <w:r>
         <w:t xml:space="preserve">.</w:t>
       </w:r>
@@ -564,322 +1232,570 @@
         <w:pStyle w:val="ListParagraph"/>
         <w:numPr>
           <w:ilvl w:val="0"/>
+          <w:numId w:val="3"/>
+        </w:numPr>
+        <w:spacing w:after="70"/>
+      </w:pPr>
+      <w:r>
+        <w:t xml:space="preserve">Identifies billing cycles that cross calendar-month boundaries.</w:t>
+      </w:r>
+    </w:p>
+    <w:p>
+      <w:pPr>
+        <w:pStyle w:val="ListParagraph"/>
+        <w:numPr>
+          <w:ilvl w:val="0"/>
+          <w:numId w:val="3"/>
+        </w:numPr>
+        <w:spacing w:after="70"/>
+      </w:pPr>
+      <w:r>
+        <w:t xml:space="preserve">Flags cases where the Monthly Value records show an inaccurate remainder because the balance was effectively restarted at the calendar-month boundary.</w:t>
+      </w:r>
+    </w:p>
+    <w:p>
+      <w:pPr>
+        <w:pStyle w:val="ListParagraph"/>
+        <w:numPr>
+          <w:ilvl w:val="0"/>
+          <w:numId w:val="3"/>
+        </w:numPr>
+        <w:spacing w:after="70"/>
+      </w:pPr>
+      <w:r>
+        <w:t xml:space="preserve">Verifies that Guest credit-type records are not included in the calculation.</w:t>
+      </w:r>
+    </w:p>
+    <w:p>
+      <w:pPr>
+        <w:pBdr>
+          <w:bottom w:val="single" w:color="D0D5DD" w:sz="6"/>
+        </w:pBdr>
+        <w:spacing w:after="180" w:before="80"/>
+      </w:pPr>
+      <w:r>
+        <w:t xml:space="preserve"/>
+      </w:r>
+    </w:p>
+    <w:p>
+      <w:pPr>
+        <w:pStyle w:val="Heading2"/>
+        <w:spacing w:after="100" w:before="220"/>
+      </w:pPr>
+      <w:r>
+        <w:rPr>
+          <w:b/>
+          <w:bCs/>
+          <w:color w:val="1A2234"/>
+        </w:rPr>
+        <w:t xml:space="preserve">Impact — inaccurate remainder balance</w:t>
+      </w:r>
+    </w:p>
+    <w:p>
+      <w:pPr>
+        <w:spacing w:after="120"/>
+      </w:pPr>
+      <w:r>
+        <w:t xml:space="preserve">This is a </w:t>
+      </w:r>
+      <w:r>
+        <w:rPr>
+          <w:b/>
+          <w:bCs/>
+        </w:rPr>
+        <w:t xml:space="preserve">data accuracy and reporting issue</w:t>
+      </w:r>
+      <w:r>
+        <w:t xml:space="preserve">. When a billing cycle crosses a calendar-month boundary, the Remainder Balance shown on the new Monthly Value can be higher than the actual remaining balance for the billing cycle.</w:t>
+      </w:r>
+    </w:p>
+    <w:p>
+      <w:pPr>
+        <w:pStyle w:val="ListParagraph"/>
+        <w:numPr>
+          <w:ilvl w:val="0"/>
           <w:numId w:val="2"/>
         </w:numPr>
-        <w:spacing w:after="80"/>
-      </w:pPr>
-      <w:r>
-        <w:t xml:space="preserve">But the October record displays </w:t>
-      </w:r>
-      <w:r>
-        <w:rPr>
-          <w:b/>
-          <w:bCs/>
+        <w:spacing w:after="70"/>
+      </w:pPr>
+      <w:r>
+        <w:rPr>
+          <w:b/>
+          <w:bCs/>
+        </w:rPr>
+        <w:t xml:space="preserve">Correct remainder: </w:t>
+      </w:r>
+      <w:r>
+        <w:t xml:space="preserve">12 minutes</w:t>
+      </w:r>
+    </w:p>
+    <w:p>
+      <w:pPr>
+        <w:pStyle w:val="ListParagraph"/>
+        <w:numPr>
+          <w:ilvl w:val="0"/>
+          <w:numId w:val="2"/>
+        </w:numPr>
+        <w:spacing w:after="70"/>
+      </w:pPr>
+      <w:r>
+        <w:rPr>
+          <w:b/>
+          <w:bCs/>
+        </w:rPr>
+        <w:t xml:space="preserve">October Monthly Value: </w:t>
+      </w:r>
+      <w:r>
+        <w:rPr>
           <w:color w:val="C0392B"/>
         </w:rPr>
+        <w:t xml:space="preserve">20 minutes</w:t>
+      </w:r>
+      <w:r>
+        <w:t xml:space="preserve"> (inaccurate — ignores September usage in the same cycle)</w:t>
+      </w:r>
+    </w:p>
+    <w:p>
+      <w:pPr>
+        <w:spacing w:after="120"/>
+      </w:pPr>
+      <w:r>
+        <w:t xml:space="preserve">This can affect: consumer-facing balance information, support investigations, internal reporting, QA and billing reviews, and any workflow that relies on the Monthly Value Remainder Balance.</w:t>
+      </w:r>
+    </w:p>
+    <w:p>
+      <w:pPr>
+        <w:pBdr>
+          <w:bottom w:val="single" w:color="D0D5DD" w:sz="6"/>
+        </w:pBdr>
+        <w:spacing w:after="180" w:before="80"/>
+      </w:pPr>
+      <w:r>
+        <w:t xml:space="preserve"/>
+      </w:r>
+    </w:p>
+    <w:p>
+      <w:pPr>
+        <w:pStyle w:val="Heading2"/>
+        <w:spacing w:after="100" w:before="220"/>
+      </w:pPr>
+      <w:r>
+        <w:rPr>
+          <w:b/>
+          <w:bCs/>
+          <w:color w:val="1A2234"/>
+        </w:rPr>
+        <w:t xml:space="preserve">Important: do not treat each Monthly Value as a separate allowance</w:t>
+      </w:r>
+    </w:p>
+    <w:p>
+      <w:pPr>
+        <w:spacing w:after="120"/>
+      </w:pPr>
+      <w:r>
+        <w:t xml:space="preserve">Monthly Value records are calendar-month records. They should not be interpreted as separate billing cycles simply because a new record appears when the calendar month changes. For a billing cycle such as September 21 → October 21, the September and October Monthly Values both belong to the same billing cycle, and the remainder must carry forward between them.</w:t>
+      </w:r>
+    </w:p>
+    <w:p>
+      <w:pPr>
+        <w:pStyle w:val="ListParagraph"/>
+        <w:numPr>
+          <w:ilvl w:val="0"/>
+          <w:numId w:val="2"/>
+        </w:numPr>
+        <w:spacing w:after="70"/>
+      </w:pPr>
+      <w:r>
+        <w:t xml:space="preserve">September: 8 minutes used → 12 minutes remaining</w:t>
+      </w:r>
+    </w:p>
+    <w:p>
+      <w:pPr>
+        <w:pStyle w:val="ListParagraph"/>
+        <w:numPr>
+          <w:ilvl w:val="0"/>
+          <w:numId w:val="2"/>
+        </w:numPr>
+        <w:spacing w:after="70"/>
+      </w:pPr>
+      <w:r>
+        <w:t xml:space="preserve">October: 0 additional minutes used → 12 minutes remaining</w:t>
+      </w:r>
+    </w:p>
+    <w:p>
+      <w:pPr>
+        <w:spacing w:after="120"/>
+      </w:pPr>
+      <w:r>
+        <w:t xml:space="preserve">The October balance should </w:t>
+      </w:r>
+      <w:r>
+        <w:rPr>
+          <w:b/>
+          <w:bCs/>
+          <w:color w:val="C0392B"/>
+        </w:rPr>
+        <w:t xml:space="preserve">not restart at 20 minutes</w:t>
+      </w:r>
+      <w:r>
+        <w:t xml:space="preserve"> simply because October is a new calendar month.</w:t>
+      </w:r>
+    </w:p>
+    <w:p>
+      <w:pPr>
+        <w:pBdr>
+          <w:bottom w:val="single" w:color="D0D5DD" w:sz="6"/>
+        </w:pBdr>
+        <w:spacing w:after="180" w:before="80"/>
+      </w:pPr>
+      <w:r>
+        <w:t xml:space="preserve"/>
+      </w:r>
+    </w:p>
+    <w:p>
+      <w:pPr>
+        <w:pStyle w:val="Heading1"/>
+        <w:spacing w:after="120" w:before="300"/>
+      </w:pPr>
+      <w:r>
+        <w:rPr>
+          <w:b/>
+          <w:bCs/>
+          <w:color w:val="1A2234"/>
+        </w:rPr>
+        <w:t xml:space="preserve">Recommendation — Owner: Data Engineering</w:t>
+      </w:r>
+    </w:p>
+    <w:p>
+      <w:pPr>
+        <w:spacing w:after="120"/>
+      </w:pPr>
+      <w:r>
+        <w:t xml:space="preserve">The correction should be made in the source data pipeline and Monthly Value calculation.</w:t>
+      </w:r>
+    </w:p>
+    <w:p>
+      <w:pPr>
+        <w:pStyle w:val="ListParagraph"/>
+        <w:numPr>
+          <w:ilvl w:val="0"/>
+          <w:numId w:val="3"/>
+        </w:numPr>
+        <w:spacing w:after="70"/>
+      </w:pPr>
+      <w:r>
+        <w:rPr>
+          <w:b/>
+          <w:bCs/>
+        </w:rPr>
+        <w:t xml:space="preserve">Calculate usage based on the billing cycle. </w:t>
+      </w:r>
+      <w:r>
+        <w:t xml:space="preserve">Use the consumer's actual billing-cycle start and end dates.</w:t>
+      </w:r>
+    </w:p>
+    <w:p>
+      <w:pPr>
+        <w:pStyle w:val="ListParagraph"/>
+        <w:numPr>
+          <w:ilvl w:val="0"/>
+          <w:numId w:val="3"/>
+        </w:numPr>
+        <w:spacing w:after="70"/>
+      </w:pPr>
+      <w:r>
+        <w:rPr>
+          <w:b/>
+          <w:bCs/>
+        </w:rPr>
+        <w:t xml:space="preserve">Carry the remainder across calendar-month boundaries. </w:t>
+      </w:r>
+      <w:r>
+        <w:t xml:space="preserve">If 8 minutes were used in September (20 − 8 = 12), that 12-minute remainder should carry into October.</w:t>
+      </w:r>
+    </w:p>
+    <w:p>
+      <w:pPr>
+        <w:pStyle w:val="ListParagraph"/>
+        <w:numPr>
+          <w:ilvl w:val="0"/>
+          <w:numId w:val="3"/>
+        </w:numPr>
+        <w:spacing w:after="70"/>
+      </w:pPr>
+      <w:r>
+        <w:rPr>
+          <w:b/>
+          <w:bCs/>
+        </w:rPr>
+        <w:t xml:space="preserve">Do not reset the remainder when the calendar month changes. </w:t>
+      </w:r>
+      <w:r>
+        <w:t xml:space="preserve">October should continue from the existing billing-cycle balance, not restart at 20 − October usage.</w:t>
+      </w:r>
+    </w:p>
+    <w:p>
+      <w:pPr>
+        <w:pStyle w:val="ListParagraph"/>
+        <w:numPr>
+          <w:ilvl w:val="0"/>
+          <w:numId w:val="3"/>
+        </w:numPr>
+        <w:spacing w:after="70"/>
+      </w:pPr>
+      <w:r>
+        <w:rPr>
+          <w:b/>
+          <w:bCs/>
+        </w:rPr>
+        <w:t xml:space="preserve">Calculate one remainder for the billing cycle: </w:t>
+      </w:r>
+      <w:r>
+        <w:rPr>
+          <w:b/>
+          <w:bCs/>
+        </w:rPr>
+        <w:t xml:space="preserve">20 − total Convo Now minutes used during the current billing cycle</w:t>
+      </w:r>
+      <w:r>
+        <w:t xml:space="preserve">.</w:t>
+      </w:r>
+    </w:p>
+    <w:p>
+      <w:pPr>
+        <w:pBdr>
+          <w:bottom w:val="single" w:color="D0D5DD" w:sz="6"/>
+        </w:pBdr>
+        <w:spacing w:after="180" w:before="80"/>
+      </w:pPr>
+      <w:r>
+        <w:t xml:space="preserve"/>
+      </w:r>
+    </w:p>
+    <w:p>
+      <w:pPr>
+        <w:pStyle w:val="Heading2"/>
+        <w:spacing w:after="100" w:before="220"/>
+      </w:pPr>
+      <w:r>
+        <w:rPr>
+          <w:b/>
+          <w:bCs/>
+          <w:color w:val="1A2234"/>
+        </w:rPr>
+        <w:t xml:space="preserve">Until the pipeline is corrected</w:t>
+      </w:r>
+    </w:p>
+    <w:p>
+      <w:pPr>
+        <w:spacing w:after="120"/>
+      </w:pPr>
+      <w:r>
+        <w:t xml:space="preserve">Until the underlying Monthly Value calculation is corrected, the QA page can be used to:</w:t>
+      </w:r>
+    </w:p>
+    <w:p>
+      <w:pPr>
+        <w:pStyle w:val="ListParagraph"/>
+        <w:numPr>
+          <w:ilvl w:val="0"/>
+          <w:numId w:val="2"/>
+        </w:numPr>
+        <w:spacing w:after="70"/>
+      </w:pPr>
+      <w:r>
+        <w:t xml:space="preserve">Identify billing cycles that cross calendar-month boundaries.</w:t>
+      </w:r>
+    </w:p>
+    <w:p>
+      <w:pPr>
+        <w:pStyle w:val="ListParagraph"/>
+        <w:numPr>
+          <w:ilvl w:val="0"/>
+          <w:numId w:val="2"/>
+        </w:numPr>
+        <w:spacing w:after="70"/>
+      </w:pPr>
+      <w:r>
+        <w:t xml:space="preserve">Compare Monthly Value usage against the actual billing cycle.</w:t>
+      </w:r>
+    </w:p>
+    <w:p>
+      <w:pPr>
+        <w:pStyle w:val="ListParagraph"/>
+        <w:numPr>
+          <w:ilvl w:val="0"/>
+          <w:numId w:val="2"/>
+        </w:numPr>
+        <w:spacing w:after="70"/>
+      </w:pPr>
+      <w:r>
+        <w:t xml:space="preserve">Calculate the correct billing-cycle remainder.</w:t>
+      </w:r>
+    </w:p>
+    <w:p>
+      <w:pPr>
+        <w:pStyle w:val="ListParagraph"/>
+        <w:numPr>
+          <w:ilvl w:val="0"/>
+          <w:numId w:val="2"/>
+        </w:numPr>
+        <w:spacing w:after="70"/>
+      </w:pPr>
+      <w:r>
+        <w:t xml:space="preserve">Identify Monthly Values displaying an inaccurate remainder.</w:t>
+      </w:r>
+    </w:p>
+    <w:p>
+      <w:pPr>
+        <w:pStyle w:val="ListParagraph"/>
+        <w:numPr>
+          <w:ilvl w:val="0"/>
+          <w:numId w:val="2"/>
+        </w:numPr>
+        <w:spacing w:after="70"/>
+      </w:pPr>
+      <w:r>
+        <w:t xml:space="preserve">Provide the affected numbers for manual review or correction.</w:t>
+      </w:r>
+    </w:p>
+    <w:p>
+      <w:pPr>
+        <w:spacing w:after="120"/>
+      </w:pPr>
+      <w:r>
+        <w:t xml:space="preserve">Treat the QA calculation as the </w:t>
+      </w:r>
+      <w:r>
+        <w:rPr>
+          <w:b/>
+          <w:bCs/>
+        </w:rPr>
+        <w:t xml:space="preserve">billing-cycle-level reference</w:t>
+      </w:r>
+      <w:r>
+        <w:t xml:space="preserve"> while the Monthly Value data remains calendar-month based.</w:t>
+      </w:r>
+    </w:p>
+    <w:p>
+      <w:pPr>
+        <w:pBdr>
+          <w:bottom w:val="single" w:color="D0D5DD" w:sz="6"/>
+        </w:pBdr>
+        <w:spacing w:after="180" w:before="80"/>
+      </w:pPr>
+      <w:r>
+        <w:t xml:space="preserve"/>
+      </w:r>
+    </w:p>
+    <w:p>
+      <w:pPr>
+        <w:pStyle w:val="Heading1"/>
+        <w:spacing w:after="120" w:before="300"/>
+      </w:pPr>
+      <w:r>
+        <w:rPr>
+          <w:b/>
+          <w:bCs/>
+          <w:color w:val="1A2234"/>
+        </w:rPr>
+        <w:t xml:space="preserve">Bottom line</w:t>
+      </w:r>
+    </w:p>
+    <w:p>
+      <w:pPr>
+        <w:spacing w:after="120"/>
+      </w:pPr>
+      <w:r>
+        <w:rPr>
+          <w:b/>
+          <w:bCs/>
+        </w:rPr>
+        <w:t xml:space="preserve">Convo Now Monthly Values follow calendar months, while the consumer's allowance follows the billing cycle. </w:t>
+      </w:r>
+      <w:r>
+        <w:t xml:space="preserve">When a billing cycle crosses from one calendar month into another, the remaining balance should carry forward. For a September 21 → October 21 cycle:</w:t>
+      </w:r>
+    </w:p>
+    <w:p>
+      <w:pPr>
+        <w:pStyle w:val="ListParagraph"/>
+        <w:numPr>
+          <w:ilvl w:val="0"/>
+          <w:numId w:val="2"/>
+        </w:numPr>
+        <w:spacing w:after="70"/>
+      </w:pPr>
+      <w:r>
+        <w:t xml:space="preserve">20-minute allowance</w:t>
+      </w:r>
+    </w:p>
+    <w:p>
+      <w:pPr>
+        <w:pStyle w:val="ListParagraph"/>
+        <w:numPr>
+          <w:ilvl w:val="0"/>
+          <w:numId w:val="2"/>
+        </w:numPr>
+        <w:spacing w:after="70"/>
+      </w:pPr>
+      <w:r>
+        <w:t xml:space="preserve">8 minutes used in September → 12 minutes remaining</w:t>
+      </w:r>
+    </w:p>
+    <w:p>
+      <w:pPr>
+        <w:pStyle w:val="ListParagraph"/>
+        <w:numPr>
+          <w:ilvl w:val="0"/>
+          <w:numId w:val="2"/>
+        </w:numPr>
+        <w:spacing w:after="70"/>
+      </w:pPr>
+      <w:r>
+        <w:t xml:space="preserve">0 additional minutes used in October → </w:t>
+      </w:r>
+      <w:r>
+        <w:rPr>
+          <w:b/>
+          <w:bCs/>
+          <w:color w:val="2F8F7F"/>
+        </w:rPr>
+        <w:t xml:space="preserve">October should still show 12 minutes remaining</w:t>
+      </w:r>
+    </w:p>
+    <w:p>
+      <w:pPr>
+        <w:spacing w:after="120"/>
+      </w:pPr>
+      <w:r>
+        <w:t xml:space="preserve">Instead, the current October Monthly Value calculates </w:t>
+      </w:r>
+      <w:r>
+        <w:rPr>
+          <w:b/>
+          <w:bCs/>
+          <w:color w:val="C0392B"/>
+        </w:rPr>
         <w:t xml:space="preserve">20 minutes remaining</w:t>
       </w:r>
       <w:r>
-        <w:t xml:space="preserve"> — it reset to a fresh 20 and ignored the 8 already used earlier in the same cycle.</w:t>
-      </w:r>
-    </w:p>
-    <w:p>
-      <w:pPr>
-        <w:pStyle w:val="ListParagraph"/>
-        <w:numPr>
-          <w:ilvl w:val="0"/>
-          <w:numId w:val="2"/>
-        </w:numPr>
-        <w:spacing w:after="80"/>
-      </w:pPr>
-      <w:r>
-        <w:t xml:space="preserve">So the balance shown is </w:t>
-      </w:r>
-      <w:r>
-        <w:rPr>
-          <w:b/>
-          <w:bCs/>
-          <w:color w:val="C0392B"/>
-        </w:rPr>
-        <w:t xml:space="preserve">misinformation</w:t>
-      </w:r>
-      <w:r>
-        <w:t xml:space="preserve">: it reports 20 remaining when the true figure is 12.</w:t>
-      </w:r>
-    </w:p>
-    <w:p>
-      <w:pPr>
-        <w:pStyle w:val="Heading2"/>
-        <w:spacing w:after="120" w:before="240"/>
-      </w:pPr>
-      <w:r>
-        <w:rPr>
-          <w:b/>
-          <w:bCs/>
-          <w:color w:val="1A2234"/>
-        </w:rPr>
-        <w:t xml:space="preserve">How we detect it (QA page logic)</w:t>
-      </w:r>
-    </w:p>
-    <w:p>
-      <w:pPr>
-        <w:spacing w:after="120"/>
-      </w:pPr>
-      <w:r>
-        <w:t xml:space="preserve">For every Convo Now + Live + Convo Now: Access Complimentary number, the page:</w:t>
-      </w:r>
-    </w:p>
-    <w:p>
-      <w:pPr>
-        <w:pStyle w:val="ListParagraph"/>
-        <w:numPr>
-          <w:ilvl w:val="0"/>
-          <w:numId w:val="3"/>
-        </w:numPr>
-        <w:spacing w:after="80"/>
-      </w:pPr>
-      <w:r>
-        <w:t xml:space="preserve">Pulls the associated Subscription billing cycle (start / end date; calculates the end from the billing cycle type if it's missing).</w:t>
-      </w:r>
-    </w:p>
-    <w:p>
-      <w:pPr>
-        <w:pStyle w:val="ListParagraph"/>
-        <w:numPr>
-          <w:ilvl w:val="0"/>
-          <w:numId w:val="3"/>
-        </w:numPr>
-        <w:spacing w:after="80"/>
-      </w:pPr>
-      <w:r>
-        <w:t xml:space="preserve">Sums the actual minutes used (Convo Now Minutes Used) across every Monthly Value that overlaps the billing cycle.</w:t>
-      </w:r>
-    </w:p>
-    <w:p>
-      <w:pPr>
-        <w:pStyle w:val="ListParagraph"/>
-        <w:numPr>
-          <w:ilvl w:val="0"/>
-          <w:numId w:val="3"/>
-        </w:numPr>
-        <w:spacing w:after="80"/>
-      </w:pPr>
-      <w:r>
-        <w:t xml:space="preserve">Computes the </w:t>
-      </w:r>
-      <w:r>
-        <w:rPr>
-          <w:b/>
-          <w:bCs/>
-        </w:rPr>
-        <w:t xml:space="preserve">correct remainder = 20 − minutes used</w:t>
-      </w:r>
-      <w:r>
-        <w:t xml:space="preserve"> — one allowance per cycle.</w:t>
-      </w:r>
-    </w:p>
-    <w:p>
-      <w:pPr>
-        <w:pStyle w:val="ListParagraph"/>
-        <w:numPr>
-          <w:ilvl w:val="0"/>
-          <w:numId w:val="3"/>
-        </w:numPr>
-        <w:spacing w:after="80"/>
-      </w:pPr>
-      <w:r>
-        <w:t xml:space="preserve">Red-flags 🚩 </w:t>
-      </w:r>
-      <w:r>
-        <w:t xml:space="preserve">any number whose cycle crosses a calendar month and therefore receives a double 20-minute allowance (shows cycle_months, hubspot_allowance, over_grant, and the correct remainder).</w:t>
-      </w:r>
-    </w:p>
-    <w:p>
-      <w:pPr>
-        <w:pStyle w:val="ListParagraph"/>
-        <w:numPr>
-          <w:ilvl w:val="0"/>
-          <w:numId w:val="3"/>
-        </w:numPr>
-        <w:spacing w:after="80"/>
-      </w:pPr>
-      <w:r>
-        <w:t xml:space="preserve">Verifies no Guest credit-type records are counted in any calculation.</w:t>
-      </w:r>
-    </w:p>
-    <w:p>
-      <w:pPr>
-        <w:spacing w:after="120"/>
-      </w:pPr>
-      <w:r>
-        <w:rPr>
-          <w:i/>
-          <w:iCs/>
-          <w:color w:val="667085"/>
-        </w:rPr>
-        <w:t xml:space="preserve">Note: </w:t>
-      </w:r>
-      <w:r>
-        <w:rPr>
-          <w:i/>
-          <w:iCs/>
-          <w:color w:val="667085"/>
-        </w:rPr>
-        <w:t xml:space="preserve">the Monthly Values Remainder Balance is correct per month, but must not be summed across months — summing is what produces the inflated 32 / 40 figures.</w:t>
-      </w:r>
-    </w:p>
-    <w:p>
-      <w:pPr>
-        <w:pStyle w:val="Heading2"/>
-        <w:spacing w:after="120" w:before="240"/>
-      </w:pPr>
-      <w:r>
-        <w:rPr>
-          <w:b/>
-          <w:bCs/>
-          <w:color w:val="1A2234"/>
-        </w:rPr>
-        <w:t xml:space="preserve">Impact — misinformation about remaining minutes</w:t>
-      </w:r>
-    </w:p>
-    <w:p>
-      <w:pPr>
-        <w:pStyle w:val="ListParagraph"/>
-        <w:numPr>
-          <w:ilvl w:val="0"/>
-          <w:numId w:val="2"/>
-        </w:numPr>
-        <w:spacing w:after="80"/>
-      </w:pPr>
-      <w:r>
-        <w:t xml:space="preserve">The Remainder Balance shows the </w:t>
-      </w:r>
-      <w:r>
-        <w:rPr>
-          <w:b/>
-          <w:bCs/>
-        </w:rPr>
-        <w:t xml:space="preserve">wrong number of remaining minutes</w:t>
-      </w:r>
-      <w:r>
-        <w:t xml:space="preserve">. In the example, October reads 20 remaining when the cycle truly has 12 left — misinformation being surfaced.</w:t>
-      </w:r>
-    </w:p>
-    <w:p>
-      <w:pPr>
-        <w:pStyle w:val="ListParagraph"/>
-        <w:numPr>
-          <w:ilvl w:val="0"/>
-          <w:numId w:val="2"/>
-        </w:numPr>
-        <w:spacing w:after="80"/>
-      </w:pPr>
-      <w:r>
-        <w:t xml:space="preserve">Anyone relying on this figure — consumers checking their balance, support, or internal reporting — sees an inaccurate remaining-minutes value, which erodes trust in the data and can drive wrong decisions.</w:t>
-      </w:r>
-    </w:p>
-    <w:p>
-      <w:pPr>
-        <w:pStyle w:val="ListParagraph"/>
-        <w:numPr>
-          <w:ilvl w:val="0"/>
-          <w:numId w:val="2"/>
-        </w:numPr>
-        <w:spacing w:after="80"/>
-      </w:pPr>
-      <w:r>
-        <w:t xml:space="preserve">This is a </w:t>
-      </w:r>
-      <w:r>
-        <w:rPr>
-          <w:b/>
-          <w:bCs/>
-        </w:rPr>
-        <w:t xml:space="preserve">data accuracy / reporting</w:t>
-      </w:r>
-      <w:r>
-        <w:t xml:space="preserve"> problem, not a billing or revenue issue — the plan's actual minute allowance is enforced correctly; only the displayed balance is wrong. The QA page's Red flags count shows how many Live complimentary numbers currently display a misleading balance.</w:t>
-      </w:r>
-    </w:p>
-    <w:p>
-      <w:pPr>
-        <w:pStyle w:val="Heading2"/>
-        <w:spacing w:after="120" w:before="240"/>
-      </w:pPr>
-      <w:r>
-        <w:rPr>
-          <w:b/>
-          <w:bCs/>
-          <w:color w:val="1A2234"/>
-        </w:rPr>
-        <w:t xml:space="preserve">Recommendation</w:t>
-      </w:r>
-    </w:p>
-    <w:p>
-      <w:pPr>
-        <w:spacing w:after="120"/>
-      </w:pPr>
-      <w:r>
-        <w:rPr>
-          <w:b/>
-          <w:bCs/>
-          <w:color w:val="2F8F7F"/>
-        </w:rPr>
-        <w:t xml:space="preserve">Owner: Data Engineering. </w:t>
-      </w:r>
-      <w:r>
-        <w:t xml:space="preserve">The fix belongs at the source — in the pipeline that computes and writes usage minutes to the Monthly Values records:</w:t>
-      </w:r>
-    </w:p>
-    <w:p>
-      <w:pPr>
-        <w:pStyle w:val="ListParagraph"/>
-        <w:numPr>
-          <w:ilvl w:val="0"/>
-          <w:numId w:val="3"/>
-        </w:numPr>
-        <w:spacing w:after="80"/>
-      </w:pPr>
-      <w:r>
-        <w:rPr>
-          <w:b/>
-          <w:bCs/>
-        </w:rPr>
-        <w:t xml:space="preserve">Correct the usage-minutes calculation</w:t>
-      </w:r>
-      <w:r>
-        <w:t xml:space="preserve"> so Convo Now Minutes Used on each Monthly Value reflects true usage.</w:t>
-      </w:r>
-    </w:p>
-    <w:p>
-      <w:pPr>
-        <w:pStyle w:val="ListParagraph"/>
-        <w:numPr>
-          <w:ilvl w:val="0"/>
-          <w:numId w:val="3"/>
-        </w:numPr>
-        <w:spacing w:after="80"/>
-      </w:pPr>
-      <w:r>
-        <w:rPr>
-          <w:b/>
-          <w:bCs/>
-        </w:rPr>
-        <w:t xml:space="preserve">Aggregate the allowance per billing cycle, not per calendar month</w:t>
-      </w:r>
-      <w:r>
-        <w:t xml:space="preserve"> — one 20-minute bucket that carries over when the cycle crosses a month boundary, instead of resetting to 20 each calendar month.</w:t>
-      </w:r>
-    </w:p>
-    <w:p>
-      <w:pPr>
-        <w:spacing w:after="120"/>
-      </w:pPr>
-      <w:r>
-        <w:rPr>
-          <w:color w:val="667085"/>
-        </w:rPr>
-        <w:t xml:space="preserve">Until the pipeline is corrected, the QA page gives the correct per-cycle remainder and the list of numbers displaying an incorrect balance for manual review or correction.</w:t>
+        <w:t xml:space="preserve">, making it appear the balance reset when October began.</w:t>
+      </w:r>
+    </w:p>
+    <w:p>
+      <w:pPr>
+        <w:spacing w:after="120"/>
+      </w:pPr>
+      <w:r>
+        <w:rPr>
+          <w:b/>
+          <w:bCs/>
+        </w:rPr>
+        <w:t xml:space="preserve">The calendar month changed; the billing cycle did not. </w:t>
+      </w:r>
+      <w:r>
+        <w:t xml:space="preserve">The fix is to have the usage and remainder calculation follow the billing cycle, so the remaining balance carries across calendar-month boundaries until the cycle ends.</w:t>
       </w:r>
     </w:p>
     <w:sectPr>

</xml_diff>

<commit_message>
Explainer: add data-snapshot findings (80% false positives, usage-data signal) + CSV
8,333 flagged cross-month cycles: 6,712 (80.5%) had 0 usage (not
inaccurate), only 1,621 (19.5%) can be overstated. Note high usage
(up to 277 min) driving negative remainder_balance. Include the export CSV.

Co-Authored-By: Claude Opus 4.8 <noreply@anthropic.com>
Claude-Session: https://claude.ai/code/session_01F66m49mBUZemMGSQJ6psvs
</commit_message>
<xml_diff>
--- a/Convo_Now_Reminder_Balance_Issue.docx
+++ b/Convo_Now_Reminder_Balance_Issue.docx
@@ -1675,6 +1675,438 @@
       </w:r>
       <w:r>
         <w:t xml:space="preserve"> while the Monthly Value data remains calendar-month based.</w:t>
+      </w:r>
+    </w:p>
+    <w:p>
+      <w:pPr>
+        <w:pBdr>
+          <w:bottom w:val="single" w:color="D0D5DD" w:sz="6"/>
+        </w:pBdr>
+        <w:spacing w:after="180" w:before="80"/>
+      </w:pPr>
+      <w:r>
+        <w:t xml:space="preserve"/>
+      </w:r>
+    </w:p>
+    <w:p>
+      <w:pPr>
+        <w:pStyle w:val="Heading1"/>
+        <w:spacing w:after="120" w:before="300"/>
+      </w:pPr>
+      <w:r>
+        <w:rPr>
+          <w:b/>
+          <w:bCs/>
+          <w:color w:val="1A2234"/>
+        </w:rPr>
+        <w:t xml:space="preserve">Findings from the current data snapshot</w:t>
+      </w:r>
+    </w:p>
+    <w:p>
+      <w:pPr>
+        <w:spacing w:after="120"/>
+      </w:pPr>
+      <w:r>
+        <w:t xml:space="preserve">An export of all cross-month Convo Now: Access Complimentary cycles (30-day cycles spanning two calendar months) returned 8,333 numbers. Splitting them clarifies the real scope:</w:t>
+      </w:r>
+    </w:p>
+    <w:p>
+      <w:pPr>
+        <w:spacing w:after="80"/>
+      </w:pPr>
+      <w:r>
+        <w:t xml:space="preserve"/>
+      </w:r>
+    </w:p>
+    <w:tbl>
+      <w:tblPr>
+        <w:tblW w:type="dxa" w:w="9360"/>
+        <w:tblBorders>
+          <w:top w:val="single" w:color="auto" w:sz="4"/>
+          <w:left w:val="single" w:color="auto" w:sz="4"/>
+          <w:bottom w:val="single" w:color="auto" w:sz="4"/>
+          <w:right w:val="single" w:color="auto" w:sz="4"/>
+          <w:insideH w:val="single" w:color="auto" w:sz="4"/>
+          <w:insideV w:val="single" w:color="auto" w:sz="4"/>
+        </w:tblBorders>
+      </w:tblPr>
+      <w:tblGrid>
+        <w:gridCol w:w="3200"/>
+        <w:gridCol w:w="2200"/>
+        <w:gridCol w:w="3240"/>
+      </w:tblGrid>
+      <w:tr>
+        <w:trPr>
+          <w:tblHeader/>
+        </w:trPr>
+        <w:tc>
+          <w:tcPr>
+            <w:tcW w:type="dxa" w:w="3200"/>
+            <w:shd w:fill="1A2234" w:color="auto" w:val="clear"/>
+            <w:tcMar>
+              <w:top w:type="dxa" w:w="60"/>
+              <w:left w:type="dxa" w:w="100"/>
+              <w:bottom w:type="dxa" w:w="60"/>
+              <w:right w:type="dxa" w:w="100"/>
+            </w:tcMar>
+          </w:tcPr>
+          <w:p>
+            <w:pPr>
+              <w:jc w:val="left"/>
+            </w:pPr>
+            <w:r>
+              <w:rPr>
+                <w:b/>
+                <w:bCs/>
+                <w:color w:val="FFFFFF"/>
+                <w:sz w:val="20"/>
+                <w:szCs w:val="20"/>
+              </w:rPr>
+              <w:t xml:space="preserve">Group</w:t>
+            </w:r>
+          </w:p>
+        </w:tc>
+        <w:tc>
+          <w:tcPr>
+            <w:tcW w:type="dxa" w:w="2200"/>
+            <w:shd w:fill="1A2234" w:color="auto" w:val="clear"/>
+            <w:tcMar>
+              <w:top w:type="dxa" w:w="60"/>
+              <w:left w:type="dxa" w:w="100"/>
+              <w:bottom w:type="dxa" w:w="60"/>
+              <w:right w:type="dxa" w:w="100"/>
+            </w:tcMar>
+          </w:tcPr>
+          <w:p>
+            <w:pPr>
+              <w:jc w:val="center"/>
+            </w:pPr>
+            <w:r>
+              <w:rPr>
+                <w:b/>
+                <w:bCs/>
+                <w:color w:val="FFFFFF"/>
+                <w:sz w:val="20"/>
+                <w:szCs w:val="20"/>
+              </w:rPr>
+              <w:t xml:space="preserve">Count</w:t>
+            </w:r>
+          </w:p>
+        </w:tc>
+        <w:tc>
+          <w:tcPr>
+            <w:tcW w:type="dxa" w:w="3240"/>
+            <w:shd w:fill="1A2234" w:color="auto" w:val="clear"/>
+            <w:tcMar>
+              <w:top w:type="dxa" w:w="60"/>
+              <w:left w:type="dxa" w:w="100"/>
+              <w:bottom w:type="dxa" w:w="60"/>
+              <w:right w:type="dxa" w:w="100"/>
+            </w:tcMar>
+          </w:tcPr>
+          <w:p>
+            <w:pPr>
+              <w:jc w:val="center"/>
+            </w:pPr>
+            <w:r>
+              <w:rPr>
+                <w:b/>
+                <w:bCs/>
+                <w:color w:val="FFFFFF"/>
+                <w:sz w:val="20"/>
+                <w:szCs w:val="20"/>
+              </w:rPr>
+              <w:t xml:space="preserve">Meaning</w:t>
+            </w:r>
+          </w:p>
+        </w:tc>
+      </w:tr>
+      <w:tr>
+        <w:trPr>
+          <w:tblHeader w:val="off"/>
+        </w:trPr>
+        <w:tc>
+          <w:tcPr>
+            <w:tcW w:type="dxa" w:w="3200"/>
+            <w:tcMar>
+              <w:top w:type="dxa" w:w="60"/>
+              <w:left w:type="dxa" w:w="100"/>
+              <w:bottom w:type="dxa" w:w="60"/>
+              <w:right w:type="dxa" w:w="100"/>
+            </w:tcMar>
+          </w:tcPr>
+          <w:p>
+            <w:pPr>
+              <w:jc w:val="left"/>
+            </w:pPr>
+            <w:r>
+              <w:rPr>
+                <w:b w:val="false"/>
+                <w:bCs w:val="false"/>
+                <w:color w:val="1A2234"/>
+                <w:sz w:val="20"/>
+                <w:szCs w:val="20"/>
+              </w:rPr>
+              <w:t xml:space="preserve">Cross-month cycles (all)</w:t>
+            </w:r>
+          </w:p>
+        </w:tc>
+        <w:tc>
+          <w:tcPr>
+            <w:tcW w:type="dxa" w:w="2200"/>
+            <w:tcMar>
+              <w:top w:type="dxa" w:w="60"/>
+              <w:left w:type="dxa" w:w="100"/>
+              <w:bottom w:type="dxa" w:w="60"/>
+              <w:right w:type="dxa" w:w="100"/>
+            </w:tcMar>
+          </w:tcPr>
+          <w:p>
+            <w:pPr>
+              <w:jc w:val="center"/>
+            </w:pPr>
+            <w:r>
+              <w:rPr>
+                <w:b w:val="false"/>
+                <w:bCs w:val="false"/>
+                <w:color w:val="1A2234"/>
+                <w:sz w:val="20"/>
+                <w:szCs w:val="20"/>
+              </w:rPr>
+              <w:t xml:space="preserve">8,333</w:t>
+            </w:r>
+          </w:p>
+        </w:tc>
+        <w:tc>
+          <w:tcPr>
+            <w:tcW w:type="dxa" w:w="3240"/>
+            <w:tcMar>
+              <w:top w:type="dxa" w:w="60"/>
+              <w:left w:type="dxa" w:w="100"/>
+              <w:bottom w:type="dxa" w:w="60"/>
+              <w:right w:type="dxa" w:w="100"/>
+            </w:tcMar>
+          </w:tcPr>
+          <w:p>
+            <w:pPr>
+              <w:jc w:val="center"/>
+            </w:pPr>
+            <w:r>
+              <w:rPr>
+                <w:b w:val="false"/>
+                <w:bCs w:val="false"/>
+                <w:color w:val="1A2234"/>
+                <w:sz w:val="20"/>
+                <w:szCs w:val="20"/>
+              </w:rPr>
+              <w:t xml:space="preserve">30-day cycle spanning two calendar months</w:t>
+            </w:r>
+          </w:p>
+        </w:tc>
+      </w:tr>
+      <w:tr>
+        <w:trPr>
+          <w:tblHeader w:val="off"/>
+        </w:trPr>
+        <w:tc>
+          <w:tcPr>
+            <w:tcW w:type="dxa" w:w="3200"/>
+            <w:tcMar>
+              <w:top w:type="dxa" w:w="60"/>
+              <w:left w:type="dxa" w:w="100"/>
+              <w:bottom w:type="dxa" w:w="60"/>
+              <w:right w:type="dxa" w:w="100"/>
+            </w:tcMar>
+          </w:tcPr>
+          <w:p>
+            <w:pPr>
+              <w:jc w:val="left"/>
+            </w:pPr>
+            <w:r>
+              <w:rPr>
+                <w:b w:val="false"/>
+                <w:bCs w:val="false"/>
+                <w:color w:val="1A2234"/>
+                <w:sz w:val="20"/>
+                <w:szCs w:val="20"/>
+              </w:rPr>
+              <w:t xml:space="preserve">Had 0 minutes used</w:t>
+            </w:r>
+          </w:p>
+        </w:tc>
+        <w:tc>
+          <w:tcPr>
+            <w:tcW w:type="dxa" w:w="2200"/>
+            <w:tcMar>
+              <w:top w:type="dxa" w:w="60"/>
+              <w:left w:type="dxa" w:w="100"/>
+              <w:bottom w:type="dxa" w:w="60"/>
+              <w:right w:type="dxa" w:w="100"/>
+            </w:tcMar>
+          </w:tcPr>
+          <w:p>
+            <w:pPr>
+              <w:jc w:val="center"/>
+            </w:pPr>
+            <w:r>
+              <w:rPr>
+                <w:b/>
+                <w:bCs/>
+                <w:color w:val="1A2234"/>
+                <w:sz w:val="20"/>
+                <w:szCs w:val="20"/>
+              </w:rPr>
+              <w:t xml:space="preserve">6,712 (80.5%)</w:t>
+            </w:r>
+          </w:p>
+        </w:tc>
+        <w:tc>
+          <w:tcPr>
+            <w:tcW w:type="dxa" w:w="3240"/>
+            <w:tcMar>
+              <w:top w:type="dxa" w:w="60"/>
+              <w:left w:type="dxa" w:w="100"/>
+              <w:bottom w:type="dxa" w:w="60"/>
+              <w:right w:type="dxa" w:w="100"/>
+            </w:tcMar>
+          </w:tcPr>
+          <w:p>
+            <w:pPr>
+              <w:jc w:val="center"/>
+            </w:pPr>
+            <w:r>
+              <w:rPr>
+                <w:b w:val="false"/>
+                <w:bCs w:val="false"/>
+                <w:color w:val="1A2234"/>
+                <w:sz w:val="20"/>
+                <w:szCs w:val="20"/>
+              </w:rPr>
+              <w:t xml:space="preserve">Not inaccurate — later month correctly shows 20</w:t>
+            </w:r>
+          </w:p>
+        </w:tc>
+      </w:tr>
+      <w:tr>
+        <w:trPr>
+          <w:tblHeader w:val="off"/>
+        </w:trPr>
+        <w:tc>
+          <w:tcPr>
+            <w:tcW w:type="dxa" w:w="3200"/>
+            <w:tcMar>
+              <w:top w:type="dxa" w:w="60"/>
+              <w:left w:type="dxa" w:w="100"/>
+              <w:bottom w:type="dxa" w:w="60"/>
+              <w:right w:type="dxa" w:w="100"/>
+            </w:tcMar>
+          </w:tcPr>
+          <w:p>
+            <w:pPr>
+              <w:jc w:val="left"/>
+            </w:pPr>
+            <w:r>
+              <w:rPr>
+                <w:b w:val="false"/>
+                <w:bCs w:val="false"/>
+                <w:color w:val="1A2234"/>
+                <w:sz w:val="20"/>
+                <w:szCs w:val="20"/>
+              </w:rPr>
+              <w:t xml:space="preserve">Had usage &gt; 0</w:t>
+            </w:r>
+          </w:p>
+        </w:tc>
+        <w:tc>
+          <w:tcPr>
+            <w:tcW w:type="dxa" w:w="2200"/>
+            <w:tcMar>
+              <w:top w:type="dxa" w:w="60"/>
+              <w:left w:type="dxa" w:w="100"/>
+              <w:bottom w:type="dxa" w:w="60"/>
+              <w:right w:type="dxa" w:w="100"/>
+            </w:tcMar>
+          </w:tcPr>
+          <w:p>
+            <w:pPr>
+              <w:jc w:val="center"/>
+            </w:pPr>
+            <w:r>
+              <w:rPr>
+                <w:b/>
+                <w:bCs/>
+                <w:color w:val="C0392B"/>
+                <w:sz w:val="20"/>
+                <w:szCs w:val="20"/>
+              </w:rPr>
+              <w:t xml:space="preserve">1,621 (19.5%)</w:t>
+            </w:r>
+          </w:p>
+        </w:tc>
+        <w:tc>
+          <w:tcPr>
+            <w:tcW w:type="dxa" w:w="3240"/>
+            <w:tcMar>
+              <w:top w:type="dxa" w:w="60"/>
+              <w:left w:type="dxa" w:w="100"/>
+              <w:bottom w:type="dxa" w:w="60"/>
+              <w:right w:type="dxa" w:w="100"/>
+            </w:tcMar>
+          </w:tcPr>
+          <w:p>
+            <w:pPr>
+              <w:jc w:val="center"/>
+            </w:pPr>
+            <w:r>
+              <w:rPr>
+                <w:b w:val="false"/>
+                <w:bCs w:val="false"/>
+                <w:color w:val="1A2234"/>
+                <w:sz w:val="20"/>
+                <w:szCs w:val="20"/>
+              </w:rPr>
+              <w:t xml:space="preserve">The only cases that can be overstated</w:t>
+            </w:r>
+          </w:p>
+        </w:tc>
+      </w:tr>
+    </w:tbl>
+    <w:p>
+      <w:pPr>
+        <w:spacing w:after="80"/>
+      </w:pPr>
+      <w:r>
+        <w:t xml:space="preserve"/>
+      </w:r>
+    </w:p>
+    <w:p>
+      <w:pPr>
+        <w:spacing w:after="120"/>
+      </w:pPr>
+      <w:r>
+        <w:rPr>
+          <w:b/>
+          <w:bCs/>
+        </w:rPr>
+        <w:t xml:space="preserve">Takeaway: </w:t>
+      </w:r>
+      <w:r>
+        <w:t xml:space="preserve">only about 1 in 5 cross-month cycles actually displays an overstated balance. A number is only mis-reporting when there was usage in an earlier month of the cycle that the later month failed to carry forward. The QA page now flags only this subset.</w:t>
+      </w:r>
+    </w:p>
+    <w:p>
+      <w:pPr>
+        <w:spacing w:after="120"/>
+      </w:pPr>
+      <w:r>
+        <w:rPr>
+          <w:b/>
+          <w:bCs/>
+        </w:rPr>
+        <w:t xml:space="preserve">Secondary data-quality signal: </w:t>
+      </w:r>
+      <w:r>
+        <w:t xml:space="preserve">among the 1,621 with usage, the median is ~15 minutes, but some records show far more than the 20-minute allowance (up to 277 minutes), driving the stored remainder_balance negative (e.g. −237). Usage values beyond the plan's allowance reinforce that the usage minutes themselves need review on the data-engineering side.</w:t>
       </w:r>
     </w:p>
     <w:p>

</xml_diff>

<commit_message>
Explainer: clarify negative balance = usage over 20 min; add floor-at-0 question
Co-Authored-By: Claude Opus 4.8 <noreply@anthropic.com>
Claude-Session: https://claude.ai/code/session_01F66m49mBUZemMGSQJ6psvs
</commit_message>
<xml_diff>
--- a/Convo_Now_Reminder_Balance_Issue.docx
+++ b/Convo_Now_Reminder_Balance_Issue.docx
@@ -2106,7 +2106,47 @@
         <w:t xml:space="preserve">Secondary data-quality signal: </w:t>
       </w:r>
       <w:r>
-        <w:t xml:space="preserve">among the 1,621 with usage, the median is ~15 minutes, but some records show far more than the 20-minute allowance (up to 277 minutes), driving the stored remainder_balance negative (e.g. −237). Usage values beyond the plan's allowance reinforce that the usage minutes themselves need review on the data-engineering side.</w:t>
+        <w:t xml:space="preserve">among the 1,621 with usage, the median is ~15 minutes, but some records show far more than the 20-minute allowance (up to 277 minutes), driving the stored remainder_balance negative (e.g. −237). This follows from the formula 20 − Convo Now Minutes Used, so any usage above 20 produces a negative balance (20 − 277 = −257). Two questions for data engineering:</w:t>
+      </w:r>
+    </w:p>
+    <w:p>
+      <w:pPr>
+        <w:pStyle w:val="ListParagraph"/>
+        <w:numPr>
+          <w:ilvl w:val="0"/>
+          <w:numId w:val="3"/>
+        </w:numPr>
+        <w:spacing w:after="70"/>
+      </w:pPr>
+      <w:r>
+        <w:rPr>
+          <w:b/>
+          <w:bCs/>
+        </w:rPr>
+        <w:t xml:space="preserve">Are these high usage values correct? </w:t>
+      </w:r>
+      <w:r>
+        <w:t xml:space="preserve">Usage well beyond the allowance suggests the usage minutes themselves need review.</w:t>
+      </w:r>
+    </w:p>
+    <w:p>
+      <w:pPr>
+        <w:pStyle w:val="ListParagraph"/>
+        <w:numPr>
+          <w:ilvl w:val="0"/>
+          <w:numId w:val="3"/>
+        </w:numPr>
+        <w:spacing w:after="70"/>
+      </w:pPr>
+      <w:r>
+        <w:rPr>
+          <w:b/>
+          <w:bCs/>
+        </w:rPr>
+        <w:t xml:space="preserve">Should a complimentary balance ever go negative, </w:t>
+      </w:r>
+      <w:r>
+        <w:t xml:space="preserve">or should it floor at 0 (with anything beyond 20 minutes treated as paid/overage)? A negative “remaining minutes” is itself misinformation.</w:t>
       </w:r>
     </w:p>
     <w:p>

</xml_diff>